<commit_message>
Update to Thursday 24 Sep closes
- 10-year 5.18%, Brent $106.60, scoreboard and sector moves to Thursday
- Thursday drivers: input-cost survey, Williams on another hike, Houthi strikes
- Keep real-yield figures at Wednesday (latest with two agreeing sources)
- Script trimmed to ~4:14 spoken

Co-Authored-By: Claude Opus 5.5 <noreply@anthropic.com>
</commit_message>
<xml_diff>
--- a/Davy-Deep-Dive-Script-21-25-Sep-2026.docx
+++ b/Davy-Deep-Dive-Script-21-25-Sep-2026.docx
@@ -76,7 +76,7 @@
           <w:sz w:val="22"/>
           <w:szCs w:val="22"/>
         </w:rPr>
-        <w:t xml:space="preserve">About 4:02 of talking at a conversational pace, which leaves room for clicks inside the five-minute clock. Each slide shows three numbers and a chart; the words are all here, not on screen. Read the numbers the room can see, then say why they matter. Cues in grey tell you when to click. Press N in the deck to see this script on your own screen.</w:t>
+        <w:t xml:space="preserve">About 4:14 of talking at a conversational pace, which leaves room for clicks inside the five-minute clock. Each slide shows three numbers and a chart; the words are all here, not on screen. Read the numbers the room can see, then say why they matter. Cues in grey tell you when to click. Press N in the deck to see this script on your own screen.</w:t>
       </w:r>
     </w:p>
     <w:p>
@@ -212,7 +212,7 @@
                 <w:sz w:val="20"/>
                 <w:szCs w:val="20"/>
               </w:rPr>
-              <w:t xml:space="preserve">US 10-year yield 5.11%, Brent crude $103.08, US–China truce 10 Jan</w:t>
+              <w:t xml:space="preserve">US 10-year yield 5.18%, Brent crude $106.60, US–China truce 10 Jan</w:t>
             </w:r>
           </w:p>
         </w:tc>
@@ -269,7 +269,7 @@
                 <w:sz w:val="20"/>
                 <w:szCs w:val="20"/>
               </w:rPr>
-              <w:t xml:space="preserve">US 10-year yield 5.11%, 10-year real yield 2.76%, 5-year auction 3.1bp tail</w:t>
+              <w:t xml:space="preserve">US 10-year yield 5.18%, 10-year real yield 2.76%, 5-year auction 3.1bp tail</w:t>
             </w:r>
           </w:p>
         </w:tc>
@@ -287,7 +287,7 @@
                 <w:sz w:val="20"/>
                 <w:szCs w:val="20"/>
               </w:rPr>
-              <w:t xml:space="preserve">0:33</w:t>
+              <w:t xml:space="preserve">0:39</w:t>
             </w:r>
           </w:p>
         </w:tc>
@@ -326,7 +326,7 @@
                 <w:sz w:val="20"/>
                 <w:szCs w:val="20"/>
               </w:rPr>
-              <w:t xml:space="preserve">Brent crude $103.08, Gulf crude exports ~8–9m b/d, US diesel $6.51/gal</w:t>
+              <w:t xml:space="preserve">Brent crude $106.60, Gulf crude exports ~8–9m b/d, US diesel $6.50/gal</w:t>
             </w:r>
           </w:p>
         </w:tc>
@@ -344,7 +344,7 @@
                 <w:sz w:val="20"/>
                 <w:szCs w:val="20"/>
               </w:rPr>
-              <w:t xml:space="preserve">0:38</w:t>
+              <w:t xml:space="preserve">0:44</w:t>
             </w:r>
           </w:p>
         </w:tc>
@@ -383,7 +383,7 @@
                 <w:sz w:val="20"/>
                 <w:szCs w:val="20"/>
               </w:rPr>
-              <w:t xml:space="preserve">US energy prices +16.3%, Euro-area inflation 3.2%, October hike odds 66–69%</w:t>
+              <w:t xml:space="preserve">US energy prices +16.3%, Euro-area inflation 3.2%, October hike odds 69%</w:t>
             </w:r>
           </w:p>
         </w:tc>
@@ -401,7 +401,7 @@
                 <w:sz w:val="20"/>
                 <w:szCs w:val="20"/>
               </w:rPr>
-              <w:t xml:space="preserve">0:30</w:t>
+              <w:t xml:space="preserve">0:25</w:t>
             </w:r>
           </w:p>
         </w:tc>
@@ -458,7 +458,7 @@
                 <w:sz w:val="20"/>
                 <w:szCs w:val="20"/>
               </w:rPr>
-              <w:t xml:space="preserve">0:36</w:t>
+              <w:t xml:space="preserve">0:39</w:t>
             </w:r>
           </w:p>
         </w:tc>
@@ -497,7 +497,7 @@
                 <w:sz w:val="20"/>
                 <w:szCs w:val="20"/>
               </w:rPr>
-              <w:t xml:space="preserve">A 60/40 fund, Wednesday −0.97%, Long Treasuries (TLT) $80.46, Bond volatility (MOVE) 95.45</w:t>
+              <w:t xml:space="preserve">A 60/40 fund, Wednesday −0.97%, Long Treasuries (TLT) $79.42, Bond volatility (MOVE) 104.58</w:t>
             </w:r>
           </w:p>
         </w:tc>
@@ -515,7 +515,7 @@
                 <w:sz w:val="20"/>
                 <w:szCs w:val="20"/>
               </w:rPr>
-              <w:t xml:space="preserve">0:36</w:t>
+              <w:t xml:space="preserve">0:38</w:t>
             </w:r>
           </w:p>
         </w:tc>
@@ -718,21 +718,21 @@
           <w:sz w:val="20"/>
           <w:szCs w:val="20"/>
         </w:rPr>
-        <w:t xml:space="preserve">•  US 10-year yield  5.11%  +10bp</w:t>
-      </w:r>
-    </w:p>
-    <w:p>
-      <w:pPr>
-        <w:spacing w:after="20"/>
-      </w:pPr>
-      <w:r>
-        <w:rPr>
-          <w:rFonts w:ascii="Calibri" w:hAnsi="Calibri" w:cs="Calibri"/>
-          <w:color w:val="6B6557"/>
-          <w:sz w:val="20"/>
-          <w:szCs w:val="20"/>
-        </w:rPr>
-        <w:t xml:space="preserve">•  Brent crude  $103.08</w:t>
+        <w:t xml:space="preserve">•  US 10-year yield  5.18%  +17bp</w:t>
+      </w:r>
+    </w:p>
+    <w:p>
+      <w:pPr>
+        <w:spacing w:after="20"/>
+      </w:pPr>
+      <w:r>
+        <w:rPr>
+          <w:rFonts w:ascii="Calibri" w:hAnsi="Calibri" w:cs="Calibri"/>
+          <w:color w:val="6B6557"/>
+          <w:sz w:val="20"/>
+          <w:szCs w:val="20"/>
+        </w:rPr>
+        <w:t xml:space="preserve">•  Brent crude  $106.60</w:t>
       </w:r>
     </w:p>
     <w:p>
@@ -781,7 +781,7 @@
           <w:sz w:val="26"/>
           <w:szCs w:val="26"/>
         </w:rPr>
-        <w:t xml:space="preserve">Right — this week I want to go deep on one thing: why the US ten-year hit five per cent, and what that is doing to portfolios.</w:t>
+        <w:t xml:space="preserve">This week I'm going deep on one thing: why the US ten-year hit five per cent, and what it's doing to portfolios.</w:t>
       </w:r>
     </w:p>
     <w:p>
@@ -809,7 +809,7 @@
           <w:sz w:val="26"/>
           <w:szCs w:val="26"/>
         </w:rPr>
-        <w:t xml:space="preserve">Three pressures landed at once: the war with Iran keeping Brent around a hundred dollars, a US–China truce extended by only two months, and a Fed raising rates again.</w:t>
+        <w:t xml:space="preserve">Three pressures landed at once: the war with Iran pushing Brent back above a hundred and five dollars, a US–China truce extended by only two months, and a Fed raising rates again.</w:t>
       </w:r>
     </w:p>
     <w:p>
@@ -822,7 +822,7 @@
           <w:sz w:val="26"/>
           <w:szCs w:val="26"/>
         </w:rPr>
-        <w:t xml:space="preserve">Look at the chart. Stocks held up — but bonds and gold, the things that normally protect a portfolio, both fell.</w:t>
+        <w:t xml:space="preserve">Look at the chart. Oil and stocks rose — but bonds and gold, the things that normally protect a portfolio, both fell.</w:t>
       </w:r>
     </w:p>
     <w:p>
@@ -884,7 +884,7 @@
           <w:sz w:val="20"/>
           <w:szCs w:val="20"/>
         </w:rPr>
-        <w:t xml:space="preserve">Mon 21 – Wed 23 Sep  ·  about 0:33  ·  Bear</w:t>
+        <w:t xml:space="preserve">Mon 21 – Thu 24 Sep  ·  about 0:39  ·  Bear</w:t>
       </w:r>
     </w:p>
     <w:p>
@@ -909,21 +909,21 @@
           <w:sz w:val="20"/>
           <w:szCs w:val="20"/>
         </w:rPr>
-        <w:t xml:space="preserve">The 10-year hit 5.11%, its highest since 2007 — and almost all of the rise is real yield, not inflation fear.</w:t>
-      </w:r>
-    </w:p>
-    <w:p>
-      <w:pPr>
-        <w:spacing w:after="20"/>
-      </w:pPr>
-      <w:r>
-        <w:rPr>
-          <w:rFonts w:ascii="Calibri" w:hAnsi="Calibri" w:cs="Calibri"/>
-          <w:color w:val="6B6557"/>
-          <w:sz w:val="20"/>
-          <w:szCs w:val="20"/>
-        </w:rPr>
-        <w:t xml:space="preserve">•  US 10-year yield  5.11%  +15bp</w:t>
+        <w:t xml:space="preserve">The 10-year hit 5.18% on Thursday, its highest since 2007 — and almost all of the rise is real yield, not inflation fear.</w:t>
+      </w:r>
+    </w:p>
+    <w:p>
+      <w:pPr>
+        <w:spacing w:after="20"/>
+      </w:pPr>
+      <w:r>
+        <w:rPr>
+          <w:rFonts w:ascii="Calibri" w:hAnsi="Calibri" w:cs="Calibri"/>
+          <w:color w:val="6B6557"/>
+          <w:sz w:val="20"/>
+          <w:szCs w:val="20"/>
+        </w:rPr>
+        <w:t xml:space="preserve">•  US 10-year yield  5.18%  +7bp</w:t>
       </w:r>
     </w:p>
     <w:p>
@@ -1000,7 +1000,7 @@
           <w:sz w:val="26"/>
           <w:szCs w:val="26"/>
         </w:rPr>
-        <w:t xml:space="preserve">The ten-year closed at five point one one per cent on Wednesday — the highest since 2007, and up ninety-three basis points this year.</w:t>
+        <w:t xml:space="preserve">The ten-year closed at five point one eight per cent on Thursday — the highest since 2007, and up a full percentage point this year.</w:t>
       </w:r>
     </w:p>
     <w:p>
@@ -1056,7 +1056,7 @@
           <w:sz w:val="26"/>
           <w:szCs w:val="26"/>
         </w:rPr>
-        <w:t xml:space="preserve">It's global, too: German ten-year yields are at their highest since 2009, and Japan's since 1996.</w:t>
+        <w:t xml:space="preserve">Thursday added fuel: a survey showed input costs rising at the fastest pace in four years, and the New York Fed's John Williams said another hike may be appropriate.</w:t>
       </w:r>
     </w:p>
     <w:p>
@@ -1118,7 +1118,7 @@
           <w:sz w:val="20"/>
           <w:szCs w:val="20"/>
         </w:rPr>
-        <w:t xml:space="preserve">Since 28 Feb  ·  about 0:38  ·  Bear</w:t>
+        <w:t xml:space="preserve">Since 28 Feb  ·  about 0:44  ·  Bear</w:t>
       </w:r>
     </w:p>
     <w:p>
@@ -1157,7 +1157,7 @@
           <w:sz w:val="20"/>
           <w:szCs w:val="20"/>
         </w:rPr>
-        <w:t xml:space="preserve">•  Brent crude  $103.08  +3.86%</w:t>
+        <w:t xml:space="preserve">•  Brent crude  $106.60  +3.41%</w:t>
       </w:r>
     </w:p>
     <w:p>
@@ -1185,7 +1185,7 @@
           <w:sz w:val="20"/>
           <w:szCs w:val="20"/>
         </w:rPr>
-        <w:t xml:space="preserve">•  US diesel  $6.51/gal</w:t>
+        <w:t xml:space="preserve">•  US diesel  $6.50/gal</w:t>
       </w:r>
     </w:p>
     <w:p>
@@ -1262,7 +1262,7 @@
           <w:sz w:val="26"/>
           <w:szCs w:val="26"/>
         </w:rPr>
-        <w:t xml:space="preserve">This week shows how headline-driven it is. Brent slipped below a hundred on hopes for the UN talks, then jumped almost four per cent on Wednesday when they didn't deliver.</w:t>
+        <w:t xml:space="preserve">This week shows how headline-driven it is. Brent slipped below a hundred on hopes for the UN talks, jumped almost four per cent on Wednesday when they didn't deliver, and more than three per cent on Thursday after Houthi missile attacks on Saudi Arabia.</w:t>
       </w:r>
     </w:p>
     <w:p>
@@ -1352,7 +1352,7 @@
           <w:sz w:val="20"/>
           <w:szCs w:val="20"/>
         </w:rPr>
-        <w:t xml:space="preserve">Latest prints  ·  about 0:30  ·  Bear</w:t>
+        <w:t xml:space="preserve">Latest prints  ·  about 0:25  ·  Bear</w:t>
       </w:r>
     </w:p>
     <w:p>
@@ -1419,7 +1419,7 @@
           <w:sz w:val="20"/>
           <w:szCs w:val="20"/>
         </w:rPr>
-        <w:t xml:space="preserve">•  October hike odds  66–69%</w:t>
+        <w:t xml:space="preserve">•  October hike odds  69%</w:t>
       </w:r>
     </w:p>
     <w:p>
@@ -1454,7 +1454,7 @@
           <w:sz w:val="26"/>
           <w:szCs w:val="26"/>
         </w:rPr>
-        <w:t xml:space="preserve">So how does a war become a five per cent yield? Through inflation. US energy prices are up sixteen per cent on a year ago, and petrol twenty-seven. In the euro area, energy adds more than a point to inflation.</w:t>
+        <w:t xml:space="preserve">So how does a war become a five per cent yield? Through inflation. US energy prices are up sixteen per cent on a year ago, and petrol twenty-seven.</w:t>
       </w:r>
     </w:p>
     <w:p>
@@ -1482,7 +1482,7 @@
           <w:sz w:val="26"/>
           <w:szCs w:val="26"/>
         </w:rPr>
-        <w:t xml:space="preserve">Every bar is well above the two per cent target. That's why the Fed hiked on the sixteenth — and why markets put roughly two-in-three odds on another hike in late October.</w:t>
+        <w:t xml:space="preserve">Every bar is well above the two per cent target. That's why the Fed hiked on the sixteenth — and why markets put roughly seven-in-ten odds on another hike in late October.</w:t>
       </w:r>
     </w:p>
     <w:p>
@@ -1544,7 +1544,7 @@
           <w:sz w:val="20"/>
           <w:szCs w:val="20"/>
         </w:rPr>
-        <w:t xml:space="preserve">Wed 23 – Fri 25 Sep  ·  about 0:36  ·  Bull lean  ·  Summit readouts due Friday</w:t>
+        <w:t xml:space="preserve">Wed 23 – Fri 25 Sep  ·  about 0:39  ·  Bull lean  ·  Summit readouts due Friday</w:t>
       </w:r>
     </w:p>
     <w:p>
@@ -1646,7 +1646,7 @@
           <w:sz w:val="26"/>
           <w:szCs w:val="26"/>
         </w:rPr>
-        <w:t xml:space="preserve">The other lever is China, and here the bull wins. Xi Jinping is in Washington, and the truce that was due to end on the tenth of November now runs to the tenth of January — past the midterms.</w:t>
+        <w:t xml:space="preserve">The other lever is China, and here the bull wins. Xi Jinping met President Trump at the White House on Thursday, and the truce that was due to end on the tenth of November now runs to the tenth of January — past the midterms.</w:t>
       </w:r>
     </w:p>
     <w:p>
@@ -1749,7 +1749,7 @@
           <w:sz w:val="20"/>
           <w:szCs w:val="20"/>
         </w:rPr>
-        <w:t xml:space="preserve">Wed 23 Sep  ·  about 0:36  ·  Bear</w:t>
+        <w:t xml:space="preserve">Wed 23 – Thu 24 Sep  ·  about 0:38  ·  Bear</w:t>
       </w:r>
     </w:p>
     <w:p>
@@ -1802,21 +1802,21 @@
           <w:sz w:val="20"/>
           <w:szCs w:val="20"/>
         </w:rPr>
-        <w:t xml:space="preserve">•  Long Treasuries (TLT)  $80.46  -1.58%</w:t>
-      </w:r>
-    </w:p>
-    <w:p>
-      <w:pPr>
-        <w:spacing w:after="20"/>
-      </w:pPr>
-      <w:r>
-        <w:rPr>
-          <w:rFonts w:ascii="Calibri" w:hAnsi="Calibri" w:cs="Calibri"/>
-          <w:color w:val="6B6557"/>
-          <w:sz w:val="20"/>
-          <w:szCs w:val="20"/>
-        </w:rPr>
-        <w:t xml:space="preserve">•  Bond volatility (MOVE)  95.45  +18.4%</w:t>
+        <w:t xml:space="preserve">•  Long Treasuries (TLT)  $79.42  -1.29%</w:t>
+      </w:r>
+    </w:p>
+    <w:p>
+      <w:pPr>
+        <w:spacing w:after="20"/>
+      </w:pPr>
+      <w:r>
+        <w:rPr>
+          <w:rFonts w:ascii="Calibri" w:hAnsi="Calibri" w:cs="Calibri"/>
+          <w:color w:val="6B6557"/>
+          <w:sz w:val="20"/>
+          <w:szCs w:val="20"/>
+        </w:rPr>
+        <w:t xml:space="preserve">•  Bond volatility (MOVE)  104.58  +29.7%</w:t>
       </w:r>
     </w:p>
     <w:p>
@@ -1893,7 +1893,7 @@
           <w:sz w:val="26"/>
           <w:szCs w:val="26"/>
         </w:rPr>
-        <w:t xml:space="preserve">The right-hand chart shows who is paying: utilities, energy and financials down two to three per cent, while AI-led tech is still up.</w:t>
+        <w:t xml:space="preserve">The right-hand chart shows who is paying: utilities down four per cent, real estate, financials and energy down two to three, while AI-led tech is up nearly three.</w:t>
       </w:r>
     </w:p>
     <w:p>
@@ -1983,7 +1983,7 @@
           <w:sz w:val="20"/>
           <w:szCs w:val="20"/>
         </w:rPr>
-        <w:t xml:space="preserve">Fri 18 Sep → latest close  ·  about 0:36  ·  Bear lean  ·  US to Wednesday · China to Thursday</w:t>
+        <w:t xml:space="preserve">Fri 18 Sep → latest close  ·  about 0:36  ·  Bear lean  ·  Closes to Thursday · Friday to come</w:t>
       </w:r>
     </w:p>
     <w:p>
@@ -2029,7 +2029,7 @@
           <w:sz w:val="26"/>
           <w:szCs w:val="26"/>
         </w:rPr>
-        <w:t xml:space="preserve">So, the scoreboard from last Friday to Wednesday's close. On the surface a quiet week — the Nasdaq and the S&amp;P both up. Underneath, bonds, gold and China all down. If you called bear, rates proved you right.</w:t>
+        <w:t xml:space="preserve">So, the scoreboard from last Friday to Thursday's close. On the surface a quiet week — the Nasdaq and the S&amp;P both up. Underneath, bonds, gold and China all down. If you called bear, rates proved you right.</w:t>
       </w:r>
     </w:p>
     <w:p>
@@ -2178,7 +2178,7 @@
           <w:sz w:val="22"/>
           <w:szCs w:val="22"/>
         </w:rPr>
-        <w:t xml:space="preserve">•  The next Fed meeting is 27–28 October; markets put the odds of a hike there at about 66–69% (CME FedWatch via Yahoo and Trading Economics, 24 Sep).</w:t>
+        <w:t xml:space="preserve">•  The next Fed meeting is 27–28 October; markets put the odds of a hike there at about 69% (CME FedWatch via Yahoo, 24 Sep).</w:t>
       </w:r>
     </w:p>
     <w:p>
@@ -2217,7 +2217,7 @@
           <w:sz w:val="22"/>
           <w:szCs w:val="22"/>
         </w:rPr>
-        <w:t xml:space="preserve">•  The 93bp is this calendar year (4.18% at the end of 2025 to 5.11%); over the twelve months to 23 Sep the rise is 99bp, the figure on the right-hand chart.</w:t>
+        <w:t xml:space="preserve">•  The 100bp is this calendar year (4.18% at the end of 2025 to 5.18%); the right-hand chart's 99bp is the twelve months to Wednesday 23 Sep, the latest real-yield data two sources agree on.</w:t>
       </w:r>
     </w:p>
     <w:p>
@@ -2343,7 +2343,7 @@
           <w:sz w:val="22"/>
           <w:szCs w:val="22"/>
         </w:rPr>
-        <w:t xml:space="preserve">•  This week gold fell 2.4% and long Treasuries 1.0% to Wednesday; the dollar index rose 0.9%.</w:t>
+        <w:t xml:space="preserve">•  To Thursday, gold fell 2.9% and long Treasuries 2.3% on the week; the dollar index rose 1.1%.</w:t>
       </w:r>
     </w:p>
     <w:p>
@@ -2356,7 +2356,7 @@
           <w:sz w:val="22"/>
           <w:szCs w:val="22"/>
         </w:rPr>
-        <w:t xml:space="preserve">•  Energy was the best S&amp;P 500 sector in 2026 to the end of August, up 42% (Investing.com, 31 Aug), though it fell 3% this week.</w:t>
+        <w:t xml:space="preserve">•  Energy was the best S&amp;P 500 sector in 2026 to the end of August, up 42% (Investing.com, 31 Aug), though it fell 2.7% this week.</w:t>
       </w:r>
     </w:p>
     <w:p>
@@ -2369,7 +2369,7 @@
           <w:sz w:val="22"/>
           <w:szCs w:val="22"/>
         </w:rPr>
-        <w:t xml:space="preserve">•  Bond volatility (MOVE) jumped 18% this week to a three-month high while equity volatility (VIX) stayed near 15 (Saxo, 24 Sep).</w:t>
+        <w:t xml:space="preserve">•  Bond volatility (MOVE) is up 30% this week to 104.6, while equity volatility (VIX) is under 16 (Yahoo, CNBC, 24 Sep).</w:t>
       </w:r>
     </w:p>
     <w:p>
@@ -2435,7 +2435,7 @@
           <w:sz w:val="20"/>
           <w:szCs w:val="20"/>
         </w:rPr>
-        <w:t xml:space="preserve">•  Portfolio figures: AP index closes; ETF closes (TLT, AGG, AOR, sector SPDRs) from Yahoo and StockAnalysis; MOVE and VIX from Investing.com and Saxo.</w:t>
+        <w:t xml:space="preserve">•  Portfolio figures: AP index closes; ETF closes (TLT, AGG, AOR, sector SPDRs) from Yahoo, StockAnalysis and CNBC; MOVE and VIX from Yahoo and CNBC.</w:t>
       </w:r>
     </w:p>
     <w:p>
@@ -2463,7 +2463,7 @@
           <w:sz w:val="20"/>
           <w:szCs w:val="20"/>
         </w:rPr>
-        <w:t xml:space="preserve">•  US figures, oil and gold run to Wednesday’s close; China and Hong Kong to Thursday’s. Check the Friday readouts from the White House and Xinhua before presenting.</w:t>
+        <w:t xml:space="preserve">•  US, European, oil and gold figures run to Thursday's close, as do China and Hong Kong (the mainland is shut on Friday). The real-yield figures are Wednesday's and the yuan fixing is 22 September's, the latest two sources agree on. Check the Friday readouts from the White House and Xinhua before presenting.</w:t>
       </w:r>
     </w:p>
     <w:sectPr>

</xml_diff>

<commit_message>
Rewrite script in a plain, casual voice with the key numbers spoken
Co-Authored-By: Claude Opus 5.5 <noreply@anthropic.com>
</commit_message>
<xml_diff>
--- a/Davy-Deep-Dive-Script-21-25-Sep-2026.docx
+++ b/Davy-Deep-Dive-Script-21-25-Sep-2026.docx
@@ -76,7 +76,7 @@
           <w:sz w:val="22"/>
           <w:szCs w:val="22"/>
         </w:rPr>
-        <w:t xml:space="preserve">About 4:14 of talking at a conversational pace, which leaves room for clicks inside the five-minute clock. Each slide shows three numbers and a chart; the words are all here, not on screen. Read the numbers the room can see, then say why they matter. Cues in grey tell you when to click. Press N in the deck to see this script on your own screen.</w:t>
+        <w:t xml:space="preserve">About 4:22 of talking at a conversational pace, which leaves room for clicks inside the five-minute clock. Each slide shows three numbers and a chart; the words are all here, not on screen. Read the numbers the room can see, then say why they matter. Cues in grey tell you when to click. Press N in the deck to see this script on your own screen.</w:t>
       </w:r>
     </w:p>
     <w:p>
@@ -230,7 +230,7 @@
                 <w:sz w:val="20"/>
                 <w:szCs w:val="20"/>
               </w:rPr>
-              <w:t xml:space="preserve">0:33</w:t>
+              <w:t xml:space="preserve">0:43</w:t>
             </w:r>
           </w:p>
         </w:tc>
@@ -287,7 +287,7 @@
                 <w:sz w:val="20"/>
                 <w:szCs w:val="20"/>
               </w:rPr>
-              <w:t xml:space="preserve">0:39</w:t>
+              <w:t xml:space="preserve">0:41</w:t>
             </w:r>
           </w:p>
         </w:tc>
@@ -344,7 +344,7 @@
                 <w:sz w:val="20"/>
                 <w:szCs w:val="20"/>
               </w:rPr>
-              <w:t xml:space="preserve">0:44</w:t>
+              <w:t xml:space="preserve">0:39</w:t>
             </w:r>
           </w:p>
         </w:tc>
@@ -401,7 +401,7 @@
                 <w:sz w:val="20"/>
                 <w:szCs w:val="20"/>
               </w:rPr>
-              <w:t xml:space="preserve">0:25</w:t>
+              <w:t xml:space="preserve">0:31</w:t>
             </w:r>
           </w:p>
         </w:tc>
@@ -458,7 +458,7 @@
                 <w:sz w:val="20"/>
                 <w:szCs w:val="20"/>
               </w:rPr>
-              <w:t xml:space="preserve">0:39</w:t>
+              <w:t xml:space="preserve">0:34</w:t>
             </w:r>
           </w:p>
         </w:tc>
@@ -572,7 +572,7 @@
                 <w:sz w:val="20"/>
                 <w:szCs w:val="20"/>
               </w:rPr>
-              <w:t xml:space="preserve">0:36</w:t>
+              <w:t xml:space="preserve">0:35</w:t>
             </w:r>
           </w:p>
         </w:tc>
@@ -679,7 +679,7 @@
           <w:sz w:val="20"/>
           <w:szCs w:val="20"/>
         </w:rPr>
-        <w:t xml:space="preserve">Week of 21–25 Sep  ·  about 0:33  ·  Bear</w:t>
+        <w:t xml:space="preserve">Week of 21–25 Sep  ·  about 0:43  ·  Bear</w:t>
       </w:r>
     </w:p>
     <w:p>
@@ -781,7 +781,7 @@
           <w:sz w:val="26"/>
           <w:szCs w:val="26"/>
         </w:rPr>
-        <w:t xml:space="preserve">This week I'm going deep on one thing: why the US ten-year hit five per cent, and what it's doing to portfolios.</w:t>
+        <w:t xml:space="preserve">Morning everyone. This week I want to focus on one number, the US ten-year yield. It hit five point one eight per cent on Thursday, the highest since 2007.</w:t>
       </w:r>
     </w:p>
     <w:p>
@@ -809,7 +809,7 @@
           <w:sz w:val="26"/>
           <w:szCs w:val="26"/>
         </w:rPr>
-        <w:t xml:space="preserve">Three pressures landed at once: the war with Iran pushing Brent back above a hundred and five dollars, a US–China truce extended by only two months, and a Fed raising rates again.</w:t>
+        <w:t xml:space="preserve">Three things are pushing it up. The war with Iran, which has oil above a hundred dollars. A trade truce with China that only got pushed out to January. And the Fed, which is raising rates again.</w:t>
       </w:r>
     </w:p>
     <w:p>
@@ -822,7 +822,7 @@
           <w:sz w:val="26"/>
           <w:szCs w:val="26"/>
         </w:rPr>
-        <w:t xml:space="preserve">Look at the chart. Oil and stocks rose — but bonds and gold, the things that normally protect a portfolio, both fell.</w:t>
+        <w:t xml:space="preserve">Here's the week in one picture. Stocks did fine, the Nasdaq is up one and a half per cent. But the stuff that's meant to protect you went down. Bonds down, gold down almost three.</w:t>
       </w:r>
     </w:p>
     <w:p>
@@ -884,7 +884,7 @@
           <w:sz w:val="20"/>
           <w:szCs w:val="20"/>
         </w:rPr>
-        <w:t xml:space="preserve">Mon 21 – Thu 24 Sep  ·  about 0:39  ·  Bear</w:t>
+        <w:t xml:space="preserve">Mon 21 – Thu 24 Sep  ·  about 0:41  ·  Bear</w:t>
       </w:r>
     </w:p>
     <w:p>
@@ -1000,7 +1000,7 @@
           <w:sz w:val="26"/>
           <w:szCs w:val="26"/>
         </w:rPr>
-        <w:t xml:space="preserve">The ten-year closed at five point one eight per cent on Thursday — the highest since 2007, and up a full percentage point this year.</w:t>
+        <w:t xml:space="preserve">So the ten-year. Five point one eight per cent, up seven basis points on Thursday alone, and a full percentage point this year.</w:t>
       </w:r>
     </w:p>
     <w:p>
@@ -1028,7 +1028,7 @@
           <w:sz w:val="26"/>
           <w:szCs w:val="26"/>
         </w:rPr>
-        <w:t xml:space="preserve">The right-hand chart is the part people miss. The whole rise over the past year is real yield; inflation expectations haven't moved. Investors want more to lend to Washington — and Wednesday's five-year auction drew the weakest demand since 2018.</w:t>
+        <w:t xml:space="preserve">The interesting part is why. The real yield, so what you earn after inflation, went from one point seven five to two point seven six per cent in a year. That's basically the whole rise. Inflation expectations haven't moved. People just want more to lend to the US government, and on Wednesday a five-year auction had the weakest demand since 2018.</w:t>
       </w:r>
     </w:p>
     <w:p>
@@ -1056,7 +1056,7 @@
           <w:sz w:val="26"/>
           <w:szCs w:val="26"/>
         </w:rPr>
-        <w:t xml:space="preserve">Thursday added fuel: a survey showed input costs rising at the fastest pace in four years, and the New York Fed's John Williams said another hike may be appropriate.</w:t>
+        <w:t xml:space="preserve">Then on Thursday a Fed official said another hike might be needed.</w:t>
       </w:r>
     </w:p>
     <w:p>
@@ -1118,7 +1118,7 @@
           <w:sz w:val="20"/>
           <w:szCs w:val="20"/>
         </w:rPr>
-        <w:t xml:space="preserve">Since 28 Feb  ·  about 0:44  ·  Bear</w:t>
+        <w:t xml:space="preserve">Since 28 Feb  ·  about 0:39  ·  Bear</w:t>
       </w:r>
     </w:p>
     <w:p>
@@ -1234,7 +1234,7 @@
           <w:sz w:val="26"/>
           <w:szCs w:val="26"/>
         </w:rPr>
-        <w:t xml:space="preserve">Behind the yields is the war. Seven months in, the Gulf is exporting eight or nine million barrels a day — against fifteen before. Brent went from seventy-two dollars to a closing peak near a hundred and eighteen.</w:t>
+        <w:t xml:space="preserve">Behind all of this is the war, now seven months in. The Gulf is shipping eight or nine million barrels of oil a day, down from fifteen before the war.</w:t>
       </w:r>
     </w:p>
     <w:p>
@@ -1262,7 +1262,7 @@
           <w:sz w:val="26"/>
           <w:szCs w:val="26"/>
         </w:rPr>
-        <w:t xml:space="preserve">This week shows how headline-driven it is. Brent slipped below a hundred on hopes for the UN talks, jumped almost four per cent on Wednesday when they didn't deliver, and more than three per cent on Thursday after Houthi missile attacks on Saudi Arabia.</w:t>
+        <w:t xml:space="preserve">This week oil just followed the headlines. It dropped to ninety-nine on hopes for the UN talks, jumped almost four per cent on Wednesday when they went nowhere, and another three on Thursday after attacks on Saudi Arabia. It's now at a hundred and six.</w:t>
       </w:r>
     </w:p>
     <w:p>
@@ -1290,7 +1290,7 @@
           <w:sz w:val="26"/>
           <w:szCs w:val="26"/>
         </w:rPr>
-        <w:t xml:space="preserve">Iran has floated a sixty-day ceasefire, and President Trump says a deal is likely after the midterms on the third of November.</w:t>
+        <w:t xml:space="preserve">Iran has offered a sixty-day ceasefire, and Trump says a deal could come after the midterms.</w:t>
       </w:r>
     </w:p>
     <w:p>
@@ -1352,7 +1352,7 @@
           <w:sz w:val="20"/>
           <w:szCs w:val="20"/>
         </w:rPr>
-        <w:t xml:space="preserve">Latest prints  ·  about 0:25  ·  Bear</w:t>
+        <w:t xml:space="preserve">Latest prints  ·  about 0:31  ·  Bear</w:t>
       </w:r>
     </w:p>
     <w:p>
@@ -1454,7 +1454,7 @@
           <w:sz w:val="26"/>
           <w:szCs w:val="26"/>
         </w:rPr>
-        <w:t xml:space="preserve">So how does a war become a five per cent yield? Through inflation. US energy prices are up sixteen per cent on a year ago, and petrol twenty-seven.</w:t>
+        <w:t xml:space="preserve">So how does a war push yields to five per cent? Through inflation. US energy prices are up sixteen per cent on last year, and petrol twenty-seven. Inflation is three point four per cent in the US and three point two in Europe.</w:t>
       </w:r>
     </w:p>
     <w:p>
@@ -1482,7 +1482,7 @@
           <w:sz w:val="26"/>
           <w:szCs w:val="26"/>
         </w:rPr>
-        <w:t xml:space="preserve">Every bar is well above the two per cent target. That's why the Fed hiked on the sixteenth — and why markets put roughly seven-in-ten odds on another hike in late October.</w:t>
+        <w:t xml:space="preserve">That's well above the two per cent target. So the Fed hiked on the sixteenth, and markets see about a seventy per cent chance of another hike in October.</w:t>
       </w:r>
     </w:p>
     <w:p>
@@ -1544,7 +1544,7 @@
           <w:sz w:val="20"/>
           <w:szCs w:val="20"/>
         </w:rPr>
-        <w:t xml:space="preserve">Wed 23 – Fri 25 Sep  ·  about 0:39  ·  Bull lean  ·  Summit readouts due Friday</w:t>
+        <w:t xml:space="preserve">Wed 23 – Fri 25 Sep  ·  about 0:34  ·  Bull lean  ·  Summit readouts due Friday</w:t>
       </w:r>
     </w:p>
     <w:p>
@@ -1646,7 +1646,7 @@
           <w:sz w:val="26"/>
           <w:szCs w:val="26"/>
         </w:rPr>
-        <w:t xml:space="preserve">The other lever is China, and here the bull wins. Xi Jinping met President Trump at the White House on Thursday, and the truce that was due to end on the tenth of November now runs to the tenth of January — past the midterms.</w:t>
+        <w:t xml:space="preserve">China is the one good story this week, so this is where the bull wins. Xi met Trump on Thursday, and the trade truce now runs to the tenth of January instead of November, so it gets past the midterms. The Chinese currency is at its strongest since early 2023.</w:t>
       </w:r>
     </w:p>
     <w:p>
@@ -1674,20 +1674,7 @@
           <w:sz w:val="26"/>
           <w:szCs w:val="26"/>
         </w:rPr>
-        <w:t xml:space="preserve">The yuan fixing is the strongest since early 2023.</w:t>
-      </w:r>
-    </w:p>
-    <w:p>
-      <w:pPr>
-        <w:spacing w:after="200" w:line="340" w:lineRule="auto"/>
-      </w:pPr>
-      <w:r>
-        <w:rPr>
-          <w:rFonts w:ascii="Calibri" w:hAnsi="Calibri" w:cs="Calibri"/>
-          <w:sz w:val="26"/>
-          <w:szCs w:val="26"/>
-        </w:rPr>
-        <w:t xml:space="preserve">The catch: two months is short of the three to six markets hoped for, and the CSI 300 gave back its rally. Mainland markets are shut today for the Mid-Autumn Festival, so the full verdict comes Monday.</w:t>
+        <w:t xml:space="preserve">The downside is two months is less than markets wanted. Chinese stocks fell almost two per cent on Thursday. China's closed today, so we'll see the real reaction on Monday.</w:t>
       </w:r>
     </w:p>
     <w:p>
@@ -1865,7 +1852,7 @@
           <w:sz w:val="26"/>
           <w:szCs w:val="26"/>
         </w:rPr>
-        <w:t xml:space="preserve">Here is what it means for portfolios. On Wednesday, the day the ten-year jumped, stocks fell, long Treasuries fell one and a half per cent to a record low, and gold fell too. A sixty-forty fund lost about one per cent — both halves at once.</w:t>
+        <w:t xml:space="preserve">So what does this mean for portfolios? Wednesday was the big day, because everything fell at once. Stocks, gold, and long US bonds, which fell one and a half per cent to a record low. A normal sixty-forty portfolio lost almost one per cent in a day.</w:t>
       </w:r>
     </w:p>
     <w:p>
@@ -1893,7 +1880,7 @@
           <w:sz w:val="26"/>
           <w:szCs w:val="26"/>
         </w:rPr>
-        <w:t xml:space="preserve">The right-hand chart shows who is paying: utilities down four per cent, real estate, financials and energy down two to three, while AI-led tech is up nearly three.</w:t>
+        <w:t xml:space="preserve">Utilities are down four per cent this week, and real estate, banks and energy two to three. Tech is the one bright spot, up almost three. So bonds going up when stocks go down, that doesn't work when inflation is the problem.</w:t>
       </w:r>
     </w:p>
     <w:p>
@@ -1909,19 +1896,6 @@
           <w:szCs w:val="20"/>
         </w:rPr>
         <w:t xml:space="preserve">▸ Click — the second chart draws</w:t>
-      </w:r>
-    </w:p>
-    <w:p>
-      <w:pPr>
-        <w:spacing w:after="200" w:line="340" w:lineRule="auto"/>
-      </w:pPr>
-      <w:r>
-        <w:rPr>
-          <w:rFonts w:ascii="Calibri" w:hAnsi="Calibri" w:cs="Calibri"/>
-          <w:sz w:val="26"/>
-          <w:szCs w:val="26"/>
-        </w:rPr>
-        <w:t xml:space="preserve">The old hedge — bonds rallying when stocks fall — doesn't work while inflation is the problem.</w:t>
       </w:r>
     </w:p>
     <w:p>
@@ -1983,7 +1957,7 @@
           <w:sz w:val="20"/>
           <w:szCs w:val="20"/>
         </w:rPr>
-        <w:t xml:space="preserve">Fri 18 Sep → latest close  ·  about 0:36  ·  Bear lean  ·  Closes to Thursday · Friday to come</w:t>
+        <w:t xml:space="preserve">Fri 18 Sep → latest close  ·  about 0:35  ·  Bear lean  ·  Closes to Thursday · Friday to come</w:t>
       </w:r>
     </w:p>
     <w:p>
@@ -2029,7 +2003,7 @@
           <w:sz w:val="26"/>
           <w:szCs w:val="26"/>
         </w:rPr>
-        <w:t xml:space="preserve">So, the scoreboard from last Friday to Thursday's close. On the surface a quiet week — the Nasdaq and the S&amp;P both up. Underneath, bonds, gold and China all down. If you called bear, rates proved you right.</w:t>
+        <w:t xml:space="preserve">Here's the scoreboard from last Friday. The Nasdaq is up one point six, the S&amp;P point seven. But long bonds are down over two, and gold almost three. Rates won the week, so if you picked bear, you got it right.</w:t>
       </w:r>
     </w:p>
     <w:p>
@@ -2057,7 +2031,7 @@
           <w:sz w:val="26"/>
           <w:szCs w:val="26"/>
         </w:rPr>
-        <w:t xml:space="preserve">What to watch: US inflation on the thirtieth, the Fed in late October, the midterms on the third of November, the truce deadline on the tenth of January — and any deal on Hormuz. Until one of those changes the story, the pressure on yields stays on.</w:t>
+        <w:t xml:space="preserve">What to watch next: US inflation on the thirtieth, the Fed in October, the midterms on the third of November, the truce ending on the tenth of January, and Hormuz. Until one of those changes, yields are probably staying high.</w:t>
       </w:r>
     </w:p>
     <w:p>

</xml_diff>

<commit_message>
Six-minute talk: professional script (~5:30 spoken), clock set to 6:00
Co-Authored-By: Claude Opus 5.5 <noreply@anthropic.com>
</commit_message>
<xml_diff>
--- a/Davy-Deep-Dive-Script-21-25-Sep-2026.docx
+++ b/Davy-Deep-Dive-Script-21-25-Sep-2026.docx
@@ -76,7 +76,7 @@
           <w:sz w:val="22"/>
           <w:szCs w:val="22"/>
         </w:rPr>
-        <w:t xml:space="preserve">About 4:22 of talking at a conversational pace, which leaves room for clicks inside the five-minute clock. Each slide shows three numbers and a chart; the words are all here, not on screen. Read the numbers the room can see, then say why they matter. Cues in grey tell you when to click. Press N in the deck to see this script on your own screen.</w:t>
+        <w:t xml:space="preserve">About 5:30 of talking at a conversational pace, which leaves room for clicks inside the six-minute clock. Each slide shows three numbers and a chart; the words are all here, not on screen. Read the numbers the room can see, then say why they matter. Cues in grey tell you when to click. Press N in the deck to see this script on your own screen.</w:t>
       </w:r>
     </w:p>
     <w:p>
@@ -230,7 +230,7 @@
                 <w:sz w:val="20"/>
                 <w:szCs w:val="20"/>
               </w:rPr>
-              <w:t xml:space="preserve">0:43</w:t>
+              <w:t xml:space="preserve">0:54</w:t>
             </w:r>
           </w:p>
         </w:tc>
@@ -287,7 +287,7 @@
                 <w:sz w:val="20"/>
                 <w:szCs w:val="20"/>
               </w:rPr>
-              <w:t xml:space="preserve">0:41</w:t>
+              <w:t xml:space="preserve">0:54</w:t>
             </w:r>
           </w:p>
         </w:tc>
@@ -344,7 +344,7 @@
                 <w:sz w:val="20"/>
                 <w:szCs w:val="20"/>
               </w:rPr>
-              <w:t xml:space="preserve">0:39</w:t>
+              <w:t xml:space="preserve">0:50</w:t>
             </w:r>
           </w:p>
         </w:tc>
@@ -401,7 +401,7 @@
                 <w:sz w:val="20"/>
                 <w:szCs w:val="20"/>
               </w:rPr>
-              <w:t xml:space="preserve">0:31</w:t>
+              <w:t xml:space="preserve">0:37</w:t>
             </w:r>
           </w:p>
         </w:tc>
@@ -458,7 +458,7 @@
                 <w:sz w:val="20"/>
                 <w:szCs w:val="20"/>
               </w:rPr>
-              <w:t xml:space="preserve">0:34</w:t>
+              <w:t xml:space="preserve">0:44</w:t>
             </w:r>
           </w:p>
         </w:tc>
@@ -515,7 +515,7 @@
                 <w:sz w:val="20"/>
                 <w:szCs w:val="20"/>
               </w:rPr>
-              <w:t xml:space="preserve">0:38</w:t>
+              <w:t xml:space="preserve">0:45</w:t>
             </w:r>
           </w:p>
         </w:tc>
@@ -572,7 +572,7 @@
                 <w:sz w:val="20"/>
                 <w:szCs w:val="20"/>
               </w:rPr>
-              <w:t xml:space="preserve">0:35</w:t>
+              <w:t xml:space="preserve">0:47</w:t>
             </w:r>
           </w:p>
         </w:tc>
@@ -679,7 +679,7 @@
           <w:sz w:val="20"/>
           <w:szCs w:val="20"/>
         </w:rPr>
-        <w:t xml:space="preserve">Week of 21–25 Sep  ·  about 0:43  ·  Bear</w:t>
+        <w:t xml:space="preserve">Week of 21–25 Sep  ·  about 0:54  ·  Bear</w:t>
       </w:r>
     </w:p>
     <w:p>
@@ -781,7 +781,7 @@
           <w:sz w:val="26"/>
           <w:szCs w:val="26"/>
         </w:rPr>
-        <w:t xml:space="preserve">Morning everyone. This week I want to focus on one number, the US ten-year yield. It hit five point one eight per cent on Thursday, the highest since 2007.</w:t>
+        <w:t xml:space="preserve">Good morning, everyone. This week I'd like to focus on one number: the US ten-year Treasury yield. It closed on Thursday at five point one eight per cent — up seventeen basis points on the week, and its highest level since 2007.</w:t>
       </w:r>
     </w:p>
     <w:p>
@@ -809,7 +809,7 @@
           <w:sz w:val="26"/>
           <w:szCs w:val="26"/>
         </w:rPr>
-        <w:t xml:space="preserve">Three things are pushing it up. The war with Iran, which has oil above a hundred dollars. A trade truce with China that only got pushed out to January. And the Fed, which is raising rates again.</w:t>
+        <w:t xml:space="preserve">Three pressures are driving it: the war with Iran, which has Brent crude at a hundred and six dollars; a US–China trade truce extended only to the tenth of January; and a Federal Reserve that has started raising rates again.</w:t>
       </w:r>
     </w:p>
     <w:p>
@@ -822,7 +822,7 @@
           <w:sz w:val="26"/>
           <w:szCs w:val="26"/>
         </w:rPr>
-        <w:t xml:space="preserve">Here's the week in one picture. Stocks did fine, the Nasdaq is up one and a half per cent. But the stuff that's meant to protect you went down. Bonds down, gold down almost three.</w:t>
+        <w:t xml:space="preserve">The chart shows the week in one picture. Equities held up — the Nasdaq is up one and a half per cent. But the assets that normally protect a portfolio have fallen: bonds down one per cent, long-dated Treasuries more than two, and gold almost three.</w:t>
       </w:r>
     </w:p>
     <w:p>
@@ -884,7 +884,7 @@
           <w:sz w:val="20"/>
           <w:szCs w:val="20"/>
         </w:rPr>
-        <w:t xml:space="preserve">Mon 21 – Thu 24 Sep  ·  about 0:41  ·  Bear</w:t>
+        <w:t xml:space="preserve">Mon 21 – Thu 24 Sep  ·  about 0:54  ·  Bear</w:t>
       </w:r>
     </w:p>
     <w:p>
@@ -1000,7 +1000,7 @@
           <w:sz w:val="26"/>
           <w:szCs w:val="26"/>
         </w:rPr>
-        <w:t xml:space="preserve">So the ten-year. Five point one eight per cent, up seven basis points on Thursday alone, and a full percentage point this year.</w:t>
+        <w:t xml:space="preserve">Turning to the ten-year itself: five point one eight per cent, up seven basis points on Thursday and a full percentage point since the start of the year.</w:t>
       </w:r>
     </w:p>
     <w:p>
@@ -1028,7 +1028,7 @@
           <w:sz w:val="26"/>
           <w:szCs w:val="26"/>
         </w:rPr>
-        <w:t xml:space="preserve">The interesting part is why. The real yield, so what you earn after inflation, went from one point seven five to two point seven six per cent in a year. That's basically the whole rise. Inflation expectations haven't moved. People just want more to lend to the US government, and on Wednesday a five-year auction had the weakest demand since 2018.</w:t>
+        <w:t xml:space="preserve">What matters is the composition. Over the past year the real yield — the return after inflation — has risen from one point seven five to two point seven six per cent. That accounts for the entire move; inflation expectations are essentially unchanged. Investors are demanding more to lend to the US government, and Wednesday's five-year auction drew the weakest demand since 2018.</w:t>
       </w:r>
     </w:p>
     <w:p>
@@ -1056,7 +1056,7 @@
           <w:sz w:val="26"/>
           <w:szCs w:val="26"/>
         </w:rPr>
-        <w:t xml:space="preserve">Then on Thursday a Fed official said another hike might be needed.</w:t>
+        <w:t xml:space="preserve">Thursday added to the pressure, with the New York Fed's John Williams saying a further hike may be appropriate. And this is a global move: German yields are at their highest since 2009, and Japan's since 1996.</w:t>
       </w:r>
     </w:p>
     <w:p>
@@ -1118,7 +1118,7 @@
           <w:sz w:val="20"/>
           <w:szCs w:val="20"/>
         </w:rPr>
-        <w:t xml:space="preserve">Since 28 Feb  ·  about 0:39  ·  Bear</w:t>
+        <w:t xml:space="preserve">Since 28 Feb  ·  about 0:50  ·  Bear</w:t>
       </w:r>
     </w:p>
     <w:p>
@@ -1234,7 +1234,7 @@
           <w:sz w:val="26"/>
           <w:szCs w:val="26"/>
         </w:rPr>
-        <w:t xml:space="preserve">Behind all of this is the war, now seven months in. The Gulf is shipping eight or nine million barrels of oil a day, down from fifteen before the war.</w:t>
+        <w:t xml:space="preserve">Behind the move in yields is the war, now in its seventh month. Gulf crude exports are running at eight to nine million barrels a day, against around fifteen million before the conflict.</w:t>
       </w:r>
     </w:p>
     <w:p>
@@ -1262,7 +1262,7 @@
           <w:sz w:val="26"/>
           <w:szCs w:val="26"/>
         </w:rPr>
-        <w:t xml:space="preserve">This week oil just followed the headlines. It dropped to ninety-nine on hopes for the UN talks, jumped almost four per cent on Wednesday when they went nowhere, and another three on Thursday after attacks on Saudi Arabia. It's now at a hundred and six.</w:t>
+        <w:t xml:space="preserve">This week showed how headline-driven the market has become. Brent fell to ninety-nine dollars on Tuesday on hopes for the UN talks, rose almost four per cent on Wednesday when they failed to deliver, and a further three point four per cent on Thursday after Houthi missile attacks on Saudi Arabia. It settled at a hundred and six sixty.</w:t>
       </w:r>
     </w:p>
     <w:p>
@@ -1290,7 +1290,7 @@
           <w:sz w:val="26"/>
           <w:szCs w:val="26"/>
         </w:rPr>
-        <w:t xml:space="preserve">Iran has offered a sixty-day ceasefire, and Trump says a deal could come after the midterms.</w:t>
+        <w:t xml:space="preserve">On the diplomatic side, Iran has proposed a sixty-day ceasefire, and President Trump expects a deal after the midterms on the third of November.</w:t>
       </w:r>
     </w:p>
     <w:p>
@@ -1352,7 +1352,7 @@
           <w:sz w:val="20"/>
           <w:szCs w:val="20"/>
         </w:rPr>
-        <w:t xml:space="preserve">Latest prints  ·  about 0:31  ·  Bear</w:t>
+        <w:t xml:space="preserve">Latest prints  ·  about 0:37  ·  Bear</w:t>
       </w:r>
     </w:p>
     <w:p>
@@ -1454,7 +1454,7 @@
           <w:sz w:val="26"/>
           <w:szCs w:val="26"/>
         </w:rPr>
-        <w:t xml:space="preserve">So how does a war push yields to five per cent? Through inflation. US energy prices are up sixteen per cent on last year, and petrol twenty-seven. Inflation is three point four per cent in the US and three point two in Europe.</w:t>
+        <w:t xml:space="preserve">So how does a conflict in the Gulf become a five per cent yield? Through inflation. US energy prices are sixteen per cent higher than a year ago, and petrol twenty-seven. Headline inflation is three point four per cent in the US and three point two in the euro area.</w:t>
       </w:r>
     </w:p>
     <w:p>
@@ -1482,7 +1482,7 @@
           <w:sz w:val="26"/>
           <w:szCs w:val="26"/>
         </w:rPr>
-        <w:t xml:space="preserve">That's well above the two per cent target. So the Fed hiked on the sixteenth, and markets see about a seventy per cent chance of another hike in October.</w:t>
+        <w:t xml:space="preserve">All well above the two per cent target. That is why the Fed raised rates on the sixteenth of September, and why markets now price roughly a seventy per cent chance of a further hike in October.</w:t>
       </w:r>
     </w:p>
     <w:p>
@@ -1544,7 +1544,7 @@
           <w:sz w:val="20"/>
           <w:szCs w:val="20"/>
         </w:rPr>
-        <w:t xml:space="preserve">Wed 23 – Fri 25 Sep  ·  about 0:34  ·  Bull lean  ·  Summit readouts due Friday</w:t>
+        <w:t xml:space="preserve">Wed 23 – Fri 25 Sep  ·  about 0:44  ·  Bull lean  ·  Summit readouts due Friday</w:t>
       </w:r>
     </w:p>
     <w:p>
@@ -1646,7 +1646,7 @@
           <w:sz w:val="26"/>
           <w:szCs w:val="26"/>
         </w:rPr>
-        <w:t xml:space="preserve">China is the one good story this week, so this is where the bull wins. Xi met Trump on Thursday, and the trade truce now runs to the tenth of January instead of November, so it gets past the midterms. The Chinese currency is at its strongest since early 2023.</w:t>
+        <w:t xml:space="preserve">China provides the one constructive development this week, which is why the bull takes this slide. President Xi met President Trump on Thursday, and the trade truce, due to expire on the tenth of November, now runs to the tenth of January — beyond the midterms. The yuan is at its strongest since early 2023.</w:t>
       </w:r>
     </w:p>
     <w:p>
@@ -1674,7 +1674,7 @@
           <w:sz w:val="26"/>
           <w:szCs w:val="26"/>
         </w:rPr>
-        <w:t xml:space="preserve">The downside is two months is less than markets wanted. Chinese stocks fell almost two per cent on Thursday. China's closed today, so we'll see the real reaction on Monday.</w:t>
+        <w:t xml:space="preserve">The limitation is duration: markets had hoped for three to six months, not two. The CSI 300 fell one point seven per cent on Thursday and is down on the week. Mainland markets are closed today for the Mid-Autumn Festival, so the full reaction will come on Monday.</w:t>
       </w:r>
     </w:p>
     <w:p>
@@ -1736,7 +1736,7 @@
           <w:sz w:val="20"/>
           <w:szCs w:val="20"/>
         </w:rPr>
-        <w:t xml:space="preserve">Wed 23 – Thu 24 Sep  ·  about 0:38  ·  Bear</w:t>
+        <w:t xml:space="preserve">Wed 23 – Thu 24 Sep  ·  about 0:45  ·  Bear</w:t>
       </w:r>
     </w:p>
     <w:p>
@@ -1852,7 +1852,7 @@
           <w:sz w:val="26"/>
           <w:szCs w:val="26"/>
         </w:rPr>
-        <w:t xml:space="preserve">So what does this mean for portfolios? Wednesday was the big day, because everything fell at once. Stocks, gold, and long US bonds, which fell one and a half per cent to a record low. A normal sixty-forty portfolio lost almost one per cent in a day.</w:t>
+        <w:t xml:space="preserve">What does this mean for portfolios? Wednesday was the key session: equities, bonds and gold all fell together. The S&amp;P lost three-quarters of a per cent, gold one and a third, and long-dated Treasuries one and a half, to a record low. A standard sixty-forty portfolio lost almost one per cent in a single day.</w:t>
       </w:r>
     </w:p>
     <w:p>
@@ -1880,7 +1880,7 @@
           <w:sz w:val="26"/>
           <w:szCs w:val="26"/>
         </w:rPr>
-        <w:t xml:space="preserve">Utilities are down four per cent this week, and real estate, banks and energy two to three. Tech is the one bright spot, up almost three. So bonds going up when stocks go down, that doesn't work when inflation is the problem.</w:t>
+        <w:t xml:space="preserve">At sector level, utilities are down four per cent this week, and real estate, financials and energy between two and three. Technology is the exception, up almost three. The key point: the traditional hedge — bonds rallying when equities fall — is not working while inflation remains the dominant risk.</w:t>
       </w:r>
     </w:p>
     <w:p>
@@ -1957,7 +1957,7 @@
           <w:sz w:val="20"/>
           <w:szCs w:val="20"/>
         </w:rPr>
-        <w:t xml:space="preserve">Fri 18 Sep → latest close  ·  about 0:35  ·  Bear lean  ·  Closes to Thursday · Friday to come</w:t>
+        <w:t xml:space="preserve">Fri 18 Sep → latest close  ·  about 0:47  ·  Bear lean  ·  Closes to Thursday · Friday to come</w:t>
       </w:r>
     </w:p>
     <w:p>
@@ -2003,7 +2003,7 @@
           <w:sz w:val="26"/>
           <w:szCs w:val="26"/>
         </w:rPr>
-        <w:t xml:space="preserve">Here's the scoreboard from last Friday. The Nasdaq is up one point six, the S&amp;P point seven. But long bonds are down over two, and gold almost three. Rates won the week, so if you picked bear, you got it right.</w:t>
+        <w:t xml:space="preserve">To close, the scoreboard from last Friday. The Nasdaq is up one point six per cent and the S&amp;P seven-tenths. On the other side, long-dated Treasuries are down two point three, and gold two point nine. Rates were the dominant force this week — so for those who called bear, that call has been borne out.</w:t>
       </w:r>
     </w:p>
     <w:p>
@@ -2031,7 +2031,7 @@
           <w:sz w:val="26"/>
           <w:szCs w:val="26"/>
         </w:rPr>
-        <w:t xml:space="preserve">What to watch next: US inflation on the thirtieth, the Fed in October, the midterms on the third of November, the truce ending on the tenth of January, and Hormuz. Until one of those changes, yields are probably staying high.</w:t>
+        <w:t xml:space="preserve">Looking ahead, five things to watch: US inflation on the thirtieth of September, the Fed in late October, the midterms on the third of November, the truce deadline on the tenth of January, and any progress on Hormuz. Until one of those shifts the picture, the pressure on yields is likely to persist.</w:t>
       </w:r>
     </w:p>
     <w:p>

</xml_diff>